<commit_message>
Fase 1: Actualizar sistema de 6 rarezas (comun, especial, epica, legendaria, mitica, full_art) en C# y Firestore
</commit_message>
<xml_diff>
--- a/docs/GDD_Juego_Cartas_Futbol (1).docx
+++ b/docs/GDD_Juego_Cartas_Futbol (1).docx
@@ -648,10 +648,10 @@
           <w:b/>
           <w:bCs/>
         </w:rPr>
-        <w:t xml:space="preserve">Cartas especiales / holograficas: </w:t>
-      </w:r>
-      <w:r>
-        <w:t xml:space="preserve">variantes de arte alternativo de altisima rareza, el 'chase' principal del juego (equivalente a las cartas full-art de Pokemon TCGP).</w:t>
+        <w:t xml:space="preserve">Cartas especiales / Full Art: </w:t>
+      </w:r>
+      <w:r>
+        <w:t xml:space="preserve">variantes de arte alternativo de altisima rareza, el 'chase' principal del juego.</w:t>
       </w:r>
     </w:p>
     <w:p>
@@ -660,7 +660,15 @@
         <w:spacing w:after="140" w:before="280"/>
       </w:pPr>
       <w:r>
-        <w:t xml:space="preserve">5.2 Sistema de rareza (propuesta inicial)</w:t>
+        <w:t xml:space="preserve">5.2 Sistema de rareza</w:t>
+      </w:r>
+    </w:p>
+    <w:p>
+      <w:pPr>
+        <w:spacing w:after="160"/>
+      </w:pPr>
+      <w:r>
+        <w:t xml:space="preserve">Desde Mitica (inclusive) en adelante, la carta incluye el efecto holografico interactivo (tilt + brillo que sigue el dedo, ver prototipo validado).</w:t>
       </w:r>
     </w:p>
     <w:tbl>
@@ -792,7 +800,7 @@
                 <w:b w:val="false"/>
                 <w:bCs w:val="false"/>
               </w:rPr>
-              <w:t xml:space="preserve">~60%</w:t>
+              <w:t xml:space="preserve">~55%</w:t>
             </w:r>
           </w:p>
         </w:tc>
@@ -823,7 +831,7 @@
                 <w:b w:val="false"/>
                 <w:bCs w:val="false"/>
               </w:rPr>
-              <w:t xml:space="preserve">Poco comun</w:t>
+              <w:t xml:space="preserve">Especial</w:t>
             </w:r>
           </w:p>
         </w:tc>
@@ -882,7 +890,7 @@
                 <w:b w:val="false"/>
                 <w:bCs w:val="false"/>
               </w:rPr>
-              <w:t xml:space="preserve">Rara</w:t>
+              <w:t xml:space="preserve">Epica</w:t>
             </w:r>
           </w:p>
         </w:tc>
@@ -912,7 +920,7 @@
                 <w:b w:val="false"/>
                 <w:bCs w:val="false"/>
               </w:rPr>
-              <w:t xml:space="preserve">~10%</w:t>
+              <w:t xml:space="preserve">~12%</w:t>
             </w:r>
           </w:p>
         </w:tc>
@@ -943,7 +951,7 @@
                 <w:b w:val="false"/>
                 <w:bCs w:val="false"/>
               </w:rPr>
-              <w:t xml:space="preserve">Super rara</w:t>
+              <w:t xml:space="preserve">Legendaria</w:t>
             </w:r>
           </w:p>
         </w:tc>
@@ -971,13 +979,13 @@
                 <w:b w:val="false"/>
                 <w:bCs w:val="false"/>
               </w:rPr>
-              <w:t xml:space="preserve">~4%</w:t>
-            </w:r>
-          </w:p>
-        </w:tc>
-        <w:tc>
-          <w:tcPr>
-            <w:tcW w:type="dxa" w:w="2100"/>
+              <w:t xml:space="preserve">~5%</w:t>
+            </w:r>
+          </w:p>
+        </w:tc>
+        <w:tc>
+          <w:tcPr>
+            <w:tcW w:type="dxa" w:w="2500"/>
           </w:tcPr>
           <w:p>
             <w:r>
@@ -1002,7 +1010,69 @@
                 <w:b/>
                 <w:bCs/>
               </w:rPr>
-              <w:t xml:space="preserve">Holografica / Full-art</w:t>
+              <w:t xml:space="preserve">Mitica (holografica)</w:t>
+            </w:r>
+          </w:p>
+        </w:tc>
+        <w:tc>
+          <w:tcPr>
+            <w:tcW w:type="dxa" w:w="2400"/>
+            <w:shd w:fill="F6EFD8" w:val="clear"/>
+          </w:tcPr>
+          <w:p>
+            <w:r>
+              <w:rPr>
+                <w:b w:val="false"/>
+                <w:bCs w:val="false"/>
+              </w:rPr>
+              <w:t xml:space="preserve">3 estrellas</w:t>
+            </w:r>
+          </w:p>
+        </w:tc>
+        <w:tc>
+          <w:tcPr>
+            <w:tcW w:type="dxa" w:w="2650"/>
+            <w:shd w:fill="F6EFD8" w:val="clear"/>
+          </w:tcPr>
+          <w:p>
+            <w:r>
+              <w:rPr>
+                <w:b w:val="false"/>
+                <w:bCs w:val="false"/>
+              </w:rPr>
+              <w:t xml:space="preserve">~2%</w:t>
+            </w:r>
+          </w:p>
+        </w:tc>
+        <w:tc>
+          <w:tcPr>
+            <w:tcW w:type="dxa" w:w="2100"/>
+            <w:shd w:fill="F6EFD8" w:val="clear"/>
+          </w:tcPr>
+          <w:p>
+            <w:r>
+              <w:rPr>
+                <w:b w:val="false"/>
+                <w:bCs w:val="false"/>
+              </w:rPr>
+              <w:t xml:space="preserve">Leyenda destacada</w:t>
+            </w:r>
+          </w:p>
+        </w:tc>
+      </w:tr>
+      <w:tr>
+        <w:tc>
+          <w:tcPr>
+            <w:tcW w:type="dxa" w:w="2200"/>
+            <w:shd w:fill="F6EFD8" w:val="clear"/>
+          </w:tcPr>
+          <w:p>
+            <w:r>
+              <w:rPr>
+                <w:b/>
+                <w:bCs/>
+              </w:rPr>
+              <w:t xml:space="preserve">Full Art (holografica)</w:t>
             </w:r>
           </w:p>
         </w:tc>

</xml_diff>

<commit_message>
Fase 1: Implementar funciones de validación de forma de datos en firestore.rules según TDD Sección 7.2
</commit_message>
<xml_diff>
--- a/docs/GDD_Juego_Cartas_Futbol (1).docx
+++ b/docs/GDD_Juego_Cartas_Futbol (1).docx
@@ -571,7 +571,7 @@
         <w:t xml:space="preserve">Jugadores actuales: </w:t>
       </w:r>
       <w:r>
-        <w:t xml:space="preserve">el grueso del pool de cartas, base generica.</w:t>
+        <w:t xml:space="preserve">el grueso del pool de cartas, base generica. Cada carta tiene equipo de club Y nacionalidad como atributos independientes, para poder aparecer tanto en albumes de liga como en albumes de seleccion.</w:t>
       </w:r>
     </w:p>
     <w:p>
@@ -1181,7 +1181,7 @@
         <w:spacing w:after="80"/>
       </w:pPr>
       <w:r>
-        <w:t xml:space="preserve">Album de selecciones nacionales</w:t>
+        <w:t xml:space="preserve">Album de selecciones nacionales (agrupa cartas por el atributo de nacionalidad, no por equipo de club)</w:t>
       </w:r>
     </w:p>
     <w:p>

</xml_diff>